<commit_message>
Correct aaVJ robustness wording: TRAV13-1 at rank 29, just outside top third
</commit_message>
<xml_diff>
--- a/методология_mirpy.docx
+++ b/методология_mirpy.docx
@@ -4,8 +4,8 @@
   <w:body>
     <w:p>
       <w:pPr>
-        <w:spacing w:after="80"/>
-        <w:jc w:val="left"/>
+        <w:spacing w:line="360" w:lineRule="auto" w:after="60"/>
+        <w:jc w:val="center"/>
       </w:pPr>
       <w:r>
         <w:rPr>
@@ -19,7 +19,7 @@
     </w:p>
     <w:p>
       <w:pPr>
-        <w:spacing w:after="160"/>
+        <w:spacing w:line="360" w:lineRule="auto" w:after="240"/>
         <w:jc w:val="center"/>
       </w:pPr>
       <w:r>
@@ -34,7 +34,7 @@
     </w:p>
     <w:p>
       <w:pPr>
-        <w:spacing w:after="120"/>
+        <w:spacing w:line="360" w:lineRule="auto" w:after="120"/>
         <w:ind w:firstLine="709"/>
         <w:jc w:val="both"/>
       </w:pPr>
@@ -50,8 +50,8 @@
     </w:p>
     <w:p>
       <w:pPr>
-        <w:spacing w:after="80"/>
-        <w:jc w:val="left"/>
+        <w:spacing w:line="360" w:lineRule="auto" w:after="60"/>
+        <w:jc w:val="center"/>
       </w:pPr>
       <w:r>
         <w:rPr>
@@ -65,8 +65,8 @@
     </w:p>
     <w:p>
       <w:pPr>
-        <w:spacing w:after="80"/>
-        <w:jc w:val="left"/>
+        <w:spacing w:line="360" w:lineRule="auto" w:after="60"/>
+        <w:jc w:val="center"/>
       </w:pPr>
       <w:r>
         <w:rPr>
@@ -80,14 +80,14 @@
     </w:p>
     <w:p>
       <w:pPr>
-        <w:spacing w:after="80"/>
+        <w:spacing w:line="360" w:lineRule="auto" w:after="120"/>
         <w:jc w:val="left"/>
       </w:pPr>
       <w:r>
         <w:rPr>
           <w:rFonts w:ascii="Times New Roman" w:hAnsi="Times New Roman" w:eastAsia="Times New Roman"/>
           <w:b/>
-          <w:i/>
+          <w:i w:val="0"/>
           <w:sz w:val="24"/>
         </w:rPr>
         <w:t>Резюме</w:t>
@@ -95,7 +95,7 @@
     </w:p>
     <w:p>
       <w:pPr>
-        <w:spacing w:after="120"/>
+        <w:spacing w:line="360" w:lineRule="auto" w:after="120"/>
         <w:ind w:firstLine="709"/>
         <w:jc w:val="both"/>
       </w:pPr>
@@ -111,7 +111,7 @@
     </w:p>
     <w:p>
       <w:pPr>
-        <w:spacing w:after="120"/>
+        <w:spacing w:line="360" w:lineRule="auto" w:after="120"/>
         <w:ind w:firstLine="709"/>
         <w:jc w:val="both"/>
       </w:pPr>
@@ -127,7 +127,7 @@
     </w:p>
     <w:p>
       <w:pPr>
-        <w:spacing w:after="120"/>
+        <w:spacing w:line="360" w:lineRule="auto" w:after="120"/>
         <w:ind w:firstLine="709"/>
         <w:jc w:val="both"/>
       </w:pPr>
@@ -143,7 +143,7 @@
     </w:p>
     <w:p>
       <w:pPr>
-        <w:spacing w:after="120"/>
+        <w:spacing w:line="360" w:lineRule="auto" w:after="120"/>
         <w:ind w:firstLine="709"/>
         <w:jc w:val="both"/>
       </w:pPr>
@@ -159,7 +159,7 @@
     </w:p>
     <w:p>
       <w:pPr>
-        <w:spacing w:after="120"/>
+        <w:spacing w:line="360" w:lineRule="auto" w:after="120"/>
         <w:ind w:firstLine="709"/>
         <w:jc w:val="both"/>
       </w:pPr>
@@ -175,7 +175,7 @@
     </w:p>
     <w:p>
       <w:pPr>
-        <w:spacing w:after="120"/>
+        <w:spacing w:line="360" w:lineRule="auto" w:after="120"/>
         <w:ind w:firstLine="709"/>
         <w:jc w:val="both"/>
       </w:pPr>
@@ -191,14 +191,14 @@
     </w:p>
     <w:p>
       <w:pPr>
-        <w:spacing w:after="80"/>
+        <w:spacing w:line="360" w:lineRule="auto" w:after="120"/>
         <w:jc w:val="left"/>
       </w:pPr>
       <w:r>
         <w:rPr>
           <w:rFonts w:ascii="Times New Roman" w:hAnsi="Times New Roman" w:eastAsia="Times New Roman"/>
           <w:b/>
-          <w:i/>
+          <w:i w:val="0"/>
           <w:sz w:val="24"/>
         </w:rPr>
         <w:t>Abstract</w:t>
@@ -206,7 +206,7 @@
     </w:p>
     <w:p>
       <w:pPr>
-        <w:spacing w:after="120"/>
+        <w:spacing w:line="360" w:lineRule="auto" w:after="120"/>
         <w:ind w:firstLine="709"/>
         <w:jc w:val="both"/>
       </w:pPr>
@@ -222,7 +222,7 @@
     </w:p>
     <w:p>
       <w:pPr>
-        <w:spacing w:after="120"/>
+        <w:spacing w:line="360" w:lineRule="auto" w:after="120"/>
         <w:ind w:firstLine="709"/>
         <w:jc w:val="both"/>
       </w:pPr>
@@ -238,7 +238,7 @@
     </w:p>
     <w:p>
       <w:pPr>
-        <w:spacing w:after="120"/>
+        <w:spacing w:line="360" w:lineRule="auto" w:after="120"/>
         <w:ind w:firstLine="709"/>
         <w:jc w:val="both"/>
       </w:pPr>
@@ -254,7 +254,7 @@
     </w:p>
     <w:p>
       <w:pPr>
-        <w:spacing w:after="120"/>
+        <w:spacing w:line="360" w:lineRule="auto" w:after="120"/>
         <w:ind w:firstLine="709"/>
         <w:jc w:val="both"/>
       </w:pPr>
@@ -270,7 +270,7 @@
     </w:p>
     <w:p>
       <w:pPr>
-        <w:spacing w:after="120"/>
+        <w:spacing w:line="360" w:lineRule="auto" w:after="120"/>
         <w:ind w:firstLine="709"/>
         <w:jc w:val="both"/>
       </w:pPr>
@@ -286,7 +286,7 @@
     </w:p>
     <w:p>
       <w:pPr>
-        <w:spacing w:after="120"/>
+        <w:spacing w:line="360" w:lineRule="auto" w:after="120"/>
         <w:ind w:firstLine="709"/>
         <w:jc w:val="both"/>
       </w:pPr>
@@ -302,8 +302,8 @@
     </w:p>
     <w:p>
       <w:pPr>
-        <w:spacing w:after="80"/>
-        <w:jc w:val="left"/>
+        <w:spacing w:line="360" w:lineRule="auto" w:after="60"/>
+        <w:jc w:val="center"/>
       </w:pPr>
       <w:r>
         <w:rPr>
@@ -317,8 +317,8 @@
     </w:p>
     <w:p>
       <w:pPr>
-        <w:spacing w:after="80"/>
-        <w:jc w:val="left"/>
+        <w:spacing w:line="360" w:lineRule="auto" w:after="60"/>
+        <w:jc w:val="center"/>
       </w:pPr>
       <w:r>
         <w:rPr>
@@ -332,8 +332,8 @@
     </w:p>
     <w:p>
       <w:pPr>
-        <w:spacing w:after="80"/>
-        <w:jc w:val="left"/>
+        <w:spacing w:line="360" w:lineRule="auto" w:after="60"/>
+        <w:jc w:val="center"/>
       </w:pPr>
       <w:r>
         <w:rPr>
@@ -347,8 +347,8 @@
     </w:p>
     <w:p>
       <w:pPr>
-        <w:spacing w:after="80"/>
-        <w:jc w:val="left"/>
+        <w:spacing w:line="360" w:lineRule="auto" w:after="60"/>
+        <w:jc w:val="center"/>
       </w:pPr>
       <w:r>
         <w:rPr>
@@ -361,13 +361,8 @@
       </w:r>
     </w:p>
     <w:p>
-      <w:r>
-        <w:br w:type="page"/>
-      </w:r>
-    </w:p>
-    <w:p>
-      <w:pPr>
-        <w:spacing w:after="120"/>
+      <w:pPr>
+        <w:spacing w:line="360" w:lineRule="auto" w:after="120"/>
         <w:jc w:val="left"/>
       </w:pPr>
       <w:r>
@@ -382,7 +377,7 @@
     </w:p>
     <w:p>
       <w:pPr>
-        <w:spacing w:after="120"/>
+        <w:spacing w:line="360" w:lineRule="auto" w:after="120"/>
         <w:ind w:firstLine="709"/>
         <w:jc w:val="both"/>
       </w:pPr>
@@ -398,7 +393,7 @@
     </w:p>
     <w:p>
       <w:pPr>
-        <w:spacing w:after="120"/>
+        <w:spacing w:line="360" w:lineRule="auto" w:after="120"/>
         <w:ind w:firstLine="709"/>
         <w:jc w:val="both"/>
       </w:pPr>
@@ -414,7 +409,7 @@
     </w:p>
     <w:p>
       <w:pPr>
-        <w:spacing w:after="120"/>
+        <w:spacing w:line="360" w:lineRule="auto" w:after="120"/>
         <w:ind w:firstLine="709"/>
         <w:jc w:val="both"/>
       </w:pPr>
@@ -430,7 +425,7 @@
     </w:p>
     <w:p>
       <w:pPr>
-        <w:spacing w:after="120"/>
+        <w:spacing w:line="360" w:lineRule="auto" w:after="120"/>
         <w:ind w:firstLine="709"/>
         <w:jc w:val="both"/>
       </w:pPr>
@@ -446,7 +441,7 @@
     </w:p>
     <w:p>
       <w:pPr>
-        <w:spacing w:after="120"/>
+        <w:spacing w:line="360" w:lineRule="auto" w:after="120"/>
         <w:ind w:firstLine="709"/>
         <w:jc w:val="both"/>
       </w:pPr>
@@ -462,7 +457,7 @@
     </w:p>
     <w:p>
       <w:pPr>
-        <w:spacing w:after="120"/>
+        <w:spacing w:line="360" w:lineRule="auto" w:after="120"/>
         <w:ind w:firstLine="709"/>
         <w:jc w:val="both"/>
       </w:pPr>
@@ -478,7 +473,7 @@
     </w:p>
     <w:p>
       <w:pPr>
-        <w:spacing w:after="120"/>
+        <w:spacing w:line="360" w:lineRule="auto" w:after="120"/>
         <w:ind w:firstLine="709"/>
         <w:jc w:val="both"/>
       </w:pPr>
@@ -494,7 +489,7 @@
     </w:p>
     <w:p>
       <w:pPr>
-        <w:spacing w:after="120"/>
+        <w:spacing w:line="360" w:lineRule="auto" w:after="120"/>
         <w:ind w:firstLine="709"/>
         <w:jc w:val="both"/>
       </w:pPr>
@@ -510,7 +505,7 @@
     </w:p>
     <w:p>
       <w:pPr>
-        <w:spacing w:after="120"/>
+        <w:spacing w:line="360" w:lineRule="auto" w:after="120"/>
         <w:ind w:firstLine="709"/>
         <w:jc w:val="both"/>
       </w:pPr>
@@ -526,7 +521,7 @@
     </w:p>
     <w:p>
       <w:pPr>
-        <w:spacing w:after="120"/>
+        <w:spacing w:line="360" w:lineRule="auto" w:after="120"/>
         <w:jc w:val="left"/>
       </w:pPr>
       <w:r>
@@ -541,14 +536,14 @@
     </w:p>
     <w:p>
       <w:pPr>
-        <w:spacing w:after="80"/>
+        <w:spacing w:line="360" w:lineRule="auto" w:after="120"/>
         <w:jc w:val="left"/>
       </w:pPr>
       <w:r>
         <w:rPr>
           <w:rFonts w:ascii="Times New Roman" w:hAnsi="Times New Roman" w:eastAsia="Times New Roman"/>
           <w:b/>
-          <w:i/>
+          <w:i w:val="0"/>
           <w:sz w:val="24"/>
         </w:rPr>
         <w:t>Исходные данные и определение клонотипа</w:t>
@@ -556,7 +551,7 @@
     </w:p>
     <w:p>
       <w:pPr>
-        <w:spacing w:after="120"/>
+        <w:spacing w:line="360" w:lineRule="auto" w:after="120"/>
         <w:ind w:firstLine="709"/>
         <w:jc w:val="both"/>
       </w:pPr>
@@ -572,7 +567,7 @@
     </w:p>
     <w:p>
       <w:pPr>
-        <w:spacing w:after="120"/>
+        <w:spacing w:line="360" w:lineRule="auto" w:after="120"/>
         <w:ind w:firstLine="709"/>
         <w:jc w:val="both"/>
       </w:pPr>
@@ -588,14 +583,14 @@
     </w:p>
     <w:p>
       <w:pPr>
-        <w:spacing w:after="80"/>
+        <w:spacing w:line="360" w:lineRule="auto" w:after="120"/>
         <w:jc w:val="left"/>
       </w:pPr>
       <w:r>
         <w:rPr>
           <w:rFonts w:ascii="Times New Roman" w:hAnsi="Times New Roman" w:eastAsia="Times New Roman"/>
           <w:b/>
-          <w:i/>
+          <w:i w:val="0"/>
           <w:sz w:val="24"/>
         </w:rPr>
         <w:t>Вложение последовательностей рецептора</w:t>
@@ -603,7 +598,7 @@
     </w:p>
     <w:p>
       <w:pPr>
-        <w:spacing w:after="120"/>
+        <w:spacing w:line="360" w:lineRule="auto" w:after="120"/>
         <w:ind w:firstLine="709"/>
         <w:jc w:val="both"/>
       </w:pPr>
@@ -619,7 +614,7 @@
     </w:p>
     <w:p>
       <w:pPr>
-        <w:spacing w:after="120"/>
+        <w:spacing w:line="360" w:lineRule="auto" w:after="120"/>
         <w:ind w:firstLine="709"/>
         <w:jc w:val="both"/>
       </w:pPr>
@@ -635,14 +630,14 @@
     </w:p>
     <w:p>
       <w:pPr>
-        <w:spacing w:after="80"/>
+        <w:spacing w:line="360" w:lineRule="auto" w:after="120"/>
         <w:jc w:val="left"/>
       </w:pPr>
       <w:r>
         <w:rPr>
           <w:rFonts w:ascii="Times New Roman" w:hAnsi="Times New Roman" w:eastAsia="Times New Roman"/>
           <w:b/>
-          <w:i/>
+          <w:i w:val="0"/>
           <w:sz w:val="24"/>
         </w:rPr>
         <w:t>Плотностный анализ обогащения</w:t>
@@ -650,7 +645,7 @@
     </w:p>
     <w:p>
       <w:pPr>
-        <w:spacing w:after="120"/>
+        <w:spacing w:line="360" w:lineRule="auto" w:after="120"/>
         <w:ind w:firstLine="709"/>
         <w:jc w:val="both"/>
       </w:pPr>
@@ -666,7 +661,7 @@
     </w:p>
     <w:p>
       <w:pPr>
-        <w:spacing w:after="120"/>
+        <w:spacing w:line="360" w:lineRule="auto" w:after="120"/>
         <w:ind w:firstLine="709"/>
         <w:jc w:val="both"/>
       </w:pPr>
@@ -682,14 +677,14 @@
     </w:p>
     <w:p>
       <w:pPr>
-        <w:spacing w:after="80"/>
+        <w:spacing w:line="360" w:lineRule="auto" w:after="120"/>
         <w:jc w:val="left"/>
       </w:pPr>
       <w:r>
         <w:rPr>
           <w:rFonts w:ascii="Times New Roman" w:hAnsi="Times New Roman" w:eastAsia="Times New Roman"/>
           <w:b/>
-          <w:i/>
+          <w:i w:val="0"/>
           <w:sz w:val="24"/>
         </w:rPr>
         <w:t>Конвергентные мотивы CDR3</w:t>
@@ -697,7 +692,7 @@
     </w:p>
     <w:p>
       <w:pPr>
-        <w:spacing w:after="120"/>
+        <w:spacing w:line="360" w:lineRule="auto" w:after="120"/>
         <w:ind w:firstLine="709"/>
         <w:jc w:val="both"/>
       </w:pPr>
@@ -713,14 +708,14 @@
     </w:p>
     <w:p>
       <w:pPr>
-        <w:spacing w:after="80"/>
+        <w:spacing w:line="360" w:lineRule="auto" w:after="120"/>
         <w:jc w:val="left"/>
       </w:pPr>
       <w:r>
         <w:rPr>
           <w:rFonts w:ascii="Times New Roman" w:hAnsi="Times New Roman" w:eastAsia="Times New Roman"/>
           <w:b/>
-          <w:i/>
+          <w:i w:val="0"/>
           <w:sz w:val="24"/>
         </w:rPr>
         <w:t>Сравнение репертуаров как распределений</w:t>
@@ -728,7 +723,7 @@
     </w:p>
     <w:p>
       <w:pPr>
-        <w:spacing w:after="120"/>
+        <w:spacing w:line="360" w:lineRule="auto" w:after="120"/>
         <w:ind w:firstLine="709"/>
         <w:jc w:val="both"/>
       </w:pPr>
@@ -744,7 +739,7 @@
     </w:p>
     <w:p>
       <w:pPr>
-        <w:spacing w:after="120"/>
+        <w:spacing w:line="360" w:lineRule="auto" w:after="120"/>
         <w:ind w:firstLine="709"/>
         <w:jc w:val="both"/>
       </w:pPr>
@@ -760,7 +755,7 @@
     </w:p>
     <w:p>
       <w:pPr>
-        <w:spacing w:after="120"/>
+        <w:spacing w:line="360" w:lineRule="auto" w:after="120"/>
         <w:ind w:firstLine="709"/>
         <w:jc w:val="both"/>
       </w:pPr>
@@ -776,14 +771,14 @@
     </w:p>
     <w:p>
       <w:pPr>
-        <w:spacing w:after="80"/>
+        <w:spacing w:line="360" w:lineRule="auto" w:after="120"/>
         <w:jc w:val="left"/>
       </w:pPr>
       <w:r>
         <w:rPr>
           <w:rFonts w:ascii="Times New Roman" w:hAnsi="Times New Roman" w:eastAsia="Times New Roman"/>
           <w:b/>
-          <w:i/>
+          <w:i w:val="0"/>
           <w:sz w:val="24"/>
         </w:rPr>
         <w:t>Расширенные контрасты</w:t>
@@ -791,7 +786,7 @@
     </w:p>
     <w:p>
       <w:pPr>
-        <w:spacing w:after="120"/>
+        <w:spacing w:line="360" w:lineRule="auto" w:after="120"/>
         <w:ind w:firstLine="709"/>
         <w:jc w:val="both"/>
       </w:pPr>
@@ -807,14 +802,14 @@
     </w:p>
     <w:p>
       <w:pPr>
-        <w:spacing w:after="80"/>
+        <w:spacing w:line="360" w:lineRule="auto" w:after="120"/>
         <w:jc w:val="left"/>
       </w:pPr>
       <w:r>
         <w:rPr>
           <w:rFonts w:ascii="Times New Roman" w:hAnsi="Times New Roman" w:eastAsia="Times New Roman"/>
           <w:b/>
-          <w:i/>
+          <w:i w:val="0"/>
           <w:sz w:val="24"/>
         </w:rPr>
         <w:t>Проверка устойчивости к выбору признакового пространства</w:t>
@@ -822,7 +817,7 @@
     </w:p>
     <w:p>
       <w:pPr>
-        <w:spacing w:after="120"/>
+        <w:spacing w:line="360" w:lineRule="auto" w:after="120"/>
         <w:ind w:firstLine="709"/>
         <w:jc w:val="both"/>
       </w:pPr>
@@ -838,14 +833,14 @@
     </w:p>
     <w:p>
       <w:pPr>
-        <w:spacing w:after="80"/>
+        <w:spacing w:line="360" w:lineRule="auto" w:after="120"/>
         <w:jc w:val="left"/>
       </w:pPr>
       <w:r>
         <w:rPr>
           <w:rFonts w:ascii="Times New Roman" w:hAnsi="Times New Roman" w:eastAsia="Times New Roman"/>
           <w:b/>
-          <w:i/>
+          <w:i w:val="0"/>
           <w:sz w:val="24"/>
         </w:rPr>
         <w:t>Согласование трёх аналитических линий</w:t>
@@ -853,7 +848,7 @@
     </w:p>
     <w:p>
       <w:pPr>
-        <w:spacing w:after="120"/>
+        <w:spacing w:line="360" w:lineRule="auto" w:after="120"/>
         <w:ind w:firstLine="709"/>
         <w:jc w:val="both"/>
       </w:pPr>
@@ -869,14 +864,14 @@
     </w:p>
     <w:p>
       <w:pPr>
-        <w:spacing w:after="80"/>
+        <w:spacing w:line="360" w:lineRule="auto" w:after="120"/>
         <w:jc w:val="left"/>
       </w:pPr>
       <w:r>
         <w:rPr>
           <w:rFonts w:ascii="Times New Roman" w:hAnsi="Times New Roman" w:eastAsia="Times New Roman"/>
           <w:b/>
-          <w:i/>
+          <w:i w:val="0"/>
           <w:sz w:val="24"/>
         </w:rPr>
         <w:t>Программное обеспечение и воспроизводимость</w:t>
@@ -884,7 +879,7 @@
     </w:p>
     <w:p>
       <w:pPr>
-        <w:spacing w:after="120"/>
+        <w:spacing w:line="360" w:lineRule="auto" w:after="120"/>
         <w:ind w:firstLine="709"/>
         <w:jc w:val="both"/>
       </w:pPr>
@@ -900,7 +895,7 @@
     </w:p>
     <w:p>
       <w:pPr>
-        <w:spacing w:after="120"/>
+        <w:spacing w:line="360" w:lineRule="auto" w:after="120"/>
         <w:jc w:val="left"/>
       </w:pPr>
       <w:r>
@@ -915,14 +910,14 @@
     </w:p>
     <w:p>
       <w:pPr>
-        <w:spacing w:after="80"/>
+        <w:spacing w:line="360" w:lineRule="auto" w:after="120"/>
         <w:jc w:val="left"/>
       </w:pPr>
       <w:r>
         <w:rPr>
           <w:rFonts w:ascii="Times New Roman" w:hAnsi="Times New Roman" w:eastAsia="Times New Roman"/>
           <w:b/>
-          <w:i/>
+          <w:i w:val="0"/>
           <w:sz w:val="24"/>
         </w:rPr>
         <w:t>Плотностный анализ независимо воспроизводит приоритет TRAV4-2</w:t>
@@ -930,7 +925,7 @@
     </w:p>
     <w:p>
       <w:pPr>
-        <w:spacing w:after="120"/>
+        <w:spacing w:line="360" w:lineRule="auto" w:after="120"/>
         <w:ind w:firstLine="709"/>
         <w:jc w:val="both"/>
       </w:pPr>
@@ -946,7 +941,7 @@
     </w:p>
     <w:p>
       <w:pPr>
-        <w:spacing w:after="120"/>
+        <w:spacing w:line="360" w:lineRule="auto" w:after="120"/>
         <w:ind w:firstLine="709"/>
         <w:jc w:val="both"/>
       </w:pPr>
@@ -962,13 +957,12 @@
     </w:p>
     <w:p>
       <w:pPr>
-        <w:spacing w:before="120" w:after="40"/>
         <w:jc w:val="center"/>
       </w:pPr>
       <w:r>
         <w:drawing>
           <wp:inline xmlns:a="http://schemas.openxmlformats.org/drawingml/2006/main" xmlns:pic="http://schemas.openxmlformats.org/drawingml/2006/picture">
-            <wp:extent cx="4680000" cy="3812512"/>
+            <wp:extent cx="5400000" cy="4399052"/>
             <wp:docPr id="1" name="Picture 1"/>
             <wp:cNvGraphicFramePr>
               <a:graphicFrameLocks noChangeAspect="1"/>
@@ -989,7 +983,7 @@
                   <pic:spPr>
                     <a:xfrm>
                       <a:off x="0" y="0"/>
-                      <a:ext cx="4680000" cy="3812512"/>
+                      <a:ext cx="5400000" cy="4399052"/>
                     </a:xfrm>
                     <a:prstGeom prst="rect"/>
                   </pic:spPr>
@@ -1002,14 +996,14 @@
     </w:p>
     <w:p>
       <w:pPr>
-        <w:spacing w:after="160"/>
-        <w:jc w:val="center"/>
+        <w:spacing w:line="360" w:lineRule="auto" w:after="160"/>
+        <w:jc w:val="both"/>
       </w:pPr>
       <w:r>
         <w:rPr>
           <w:rFonts w:ascii="Times New Roman" w:hAnsi="Times New Roman" w:eastAsia="Times New Roman"/>
           <w:b w:val="0"/>
-          <w:i w:val="0"/>
+          <w:i/>
           <w:sz w:val="20"/>
         </w:rPr>
         <w:t>Рисунок 1. Ранжирование V-сегментов α-цепи по числу обогащённых в g1 клонотипов (плотностный анализ, g1 против g5 + g6; q &lt; 0,05, fold &gt; 1). Красным выделены приоритетные кандидаты исходной работы. TRAV4-2 занимает первое место, независимо воспроизводя результат операций над множествами и счётного анализа.</w:t>
@@ -1017,14 +1011,14 @@
     </w:p>
     <w:p>
       <w:pPr>
-        <w:spacing w:after="80"/>
+        <w:spacing w:line="360" w:lineRule="auto" w:after="120"/>
         <w:jc w:val="left"/>
       </w:pPr>
       <w:r>
         <w:rPr>
           <w:rFonts w:ascii="Times New Roman" w:hAnsi="Times New Roman" w:eastAsia="Times New Roman"/>
           <w:b/>
-          <w:i/>
+          <w:i w:val="0"/>
           <w:sz w:val="24"/>
         </w:rPr>
         <w:t>Репертуарная геометрия: сингенный перенос почти не возмущает репертуар, аллогенный — сдвигает его как межлинейное различие</w:t>
@@ -1032,7 +1026,7 @@
     </w:p>
     <w:p>
       <w:pPr>
-        <w:spacing w:after="120"/>
+        <w:spacing w:line="360" w:lineRule="auto" w:after="120"/>
         <w:ind w:firstLine="709"/>
         <w:jc w:val="both"/>
       </w:pPr>
@@ -1048,7 +1042,7 @@
     </w:p>
     <w:p>
       <w:pPr>
-        <w:spacing w:after="120"/>
+        <w:spacing w:line="360" w:lineRule="auto" w:after="120"/>
         <w:ind w:firstLine="709"/>
         <w:jc w:val="both"/>
       </w:pPr>
@@ -1064,7 +1058,7 @@
     </w:p>
     <w:p>
       <w:pPr>
-        <w:spacing w:after="120"/>
+        <w:spacing w:line="360" w:lineRule="auto" w:after="120"/>
         <w:ind w:firstLine="709"/>
         <w:jc w:val="both"/>
       </w:pPr>
@@ -1080,13 +1074,12 @@
     </w:p>
     <w:p>
       <w:pPr>
-        <w:spacing w:before="120" w:after="40"/>
         <w:jc w:val="center"/>
       </w:pPr>
       <w:r>
         <w:drawing>
           <wp:inline xmlns:a="http://schemas.openxmlformats.org/drawingml/2006/main" xmlns:pic="http://schemas.openxmlformats.org/drawingml/2006/picture">
-            <wp:extent cx="4680000" cy="3572060"/>
+            <wp:extent cx="5400000" cy="4409451"/>
             <wp:docPr id="2" name="Picture 2"/>
             <wp:cNvGraphicFramePr>
               <a:graphicFrameLocks noChangeAspect="1"/>
@@ -1095,7 +1088,7 @@
               <a:graphicData uri="http://schemas.openxmlformats.org/drawingml/2006/picture">
                 <pic:pic>
                   <pic:nvPicPr>
-                    <pic:cNvPr id="0" name="fig2_mmd_to_baseline.png"/>
+                    <pic:cNvPr id="0" name="fig2_repertoire_mds.png"/>
                     <pic:cNvPicPr/>
                   </pic:nvPicPr>
                   <pic:blipFill>
@@ -1107,7 +1100,7 @@
                   <pic:spPr>
                     <a:xfrm>
                       <a:off x="0" y="0"/>
-                      <a:ext cx="4680000" cy="3572060"/>
+                      <a:ext cx="5400000" cy="4409451"/>
                     </a:xfrm>
                     <a:prstGeom prst="rect"/>
                   </pic:spPr>
@@ -1120,14 +1113,14 @@
     </w:p>
     <w:p>
       <w:pPr>
-        <w:spacing w:after="160"/>
-        <w:jc w:val="center"/>
+        <w:spacing w:line="360" w:lineRule="auto" w:after="160"/>
+        <w:jc w:val="both"/>
       </w:pPr>
       <w:r>
         <w:rPr>
           <w:rFonts w:ascii="Times New Roman" w:hAnsi="Times New Roman" w:eastAsia="Times New Roman"/>
           <w:b w:val="0"/>
-          <w:i w:val="0"/>
+          <w:i/>
           <w:sz w:val="20"/>
         </w:rPr>
         <w:t>Рисунок 2. Среднее расстояние MMD от каждой группы до интактной группы g1. Пунктиром показан уровень внутригрупповой изменчивости g1. Сингенный перенос (g3) остаётся ниже этого уровня, тогда как обе аллогенные группы (g5, g6) достигают расстояния, равного различию между линиями BALB/c и C57BL/6 (g2).</w:t>
@@ -1135,14 +1128,14 @@
     </w:p>
     <w:p>
       <w:pPr>
-        <w:spacing w:after="80"/>
+        <w:spacing w:line="360" w:lineRule="auto" w:after="120"/>
         <w:jc w:val="left"/>
       </w:pPr>
       <w:r>
         <w:rPr>
           <w:rFonts w:ascii="Times New Roman" w:hAnsi="Times New Roman" w:eastAsia="Times New Roman"/>
           <w:b/>
-          <w:i/>
+          <w:i w:val="0"/>
           <w:sz w:val="24"/>
         </w:rPr>
         <w:t>Согласование трёх аналитических линий</w:t>
@@ -1150,7 +1143,7 @@
     </w:p>
     <w:p>
       <w:pPr>
-        <w:spacing w:after="120"/>
+        <w:spacing w:line="360" w:lineRule="auto" w:after="120"/>
         <w:ind w:firstLine="709"/>
         <w:jc w:val="both"/>
       </w:pPr>
@@ -1166,7 +1159,7 @@
     </w:p>
     <w:p>
       <w:pPr>
-        <w:spacing w:after="120"/>
+        <w:spacing w:line="360" w:lineRule="auto" w:after="120"/>
         <w:ind w:firstLine="709"/>
         <w:jc w:val="both"/>
       </w:pPr>
@@ -1182,13 +1175,12 @@
     </w:p>
     <w:p>
       <w:pPr>
-        <w:spacing w:before="120" w:after="40"/>
         <w:jc w:val="center"/>
       </w:pPr>
       <w:r>
         <w:drawing>
           <wp:inline xmlns:a="http://schemas.openxmlformats.org/drawingml/2006/main" xmlns:pic="http://schemas.openxmlformats.org/drawingml/2006/picture">
-            <wp:extent cx="4680000" cy="3116026"/>
+            <wp:extent cx="5400000" cy="3595415"/>
             <wp:docPr id="3" name="Picture 3"/>
             <wp:cNvGraphicFramePr>
               <a:graphicFrameLocks noChangeAspect="1"/>
@@ -1209,7 +1201,7 @@
                   <pic:spPr>
                     <a:xfrm>
                       <a:off x="0" y="0"/>
-                      <a:ext cx="4680000" cy="3116026"/>
+                      <a:ext cx="5400000" cy="3595415"/>
                     </a:xfrm>
                     <a:prstGeom prst="rect"/>
                   </pic:spPr>
@@ -1222,14 +1214,14 @@
     </w:p>
     <w:p>
       <w:pPr>
-        <w:spacing w:after="160"/>
-        <w:jc w:val="center"/>
+        <w:spacing w:line="360" w:lineRule="auto" w:after="160"/>
+        <w:jc w:val="both"/>
       </w:pPr>
       <w:r>
         <w:rPr>
           <w:rFonts w:ascii="Times New Roman" w:hAnsi="Times New Roman" w:eastAsia="Times New Roman"/>
           <w:b w:val="0"/>
-          <w:i w:val="0"/>
+          <w:i/>
           <w:sz w:val="20"/>
         </w:rPr>
         <w:t>Рисунок 3. Ранги приоритетных кандидатов исходной работы по двум линиям mirpy (счётный анализ и плотность; меньший ранг соответствует большей обогащённости в g1). Четыре из пяти кандидатов согласованно занимают верхние позиции; TRAV13-1 расположен существенно ниже по обеим линиям.</w:t>
@@ -1237,14 +1229,14 @@
     </w:p>
     <w:p>
       <w:pPr>
-        <w:spacing w:after="80"/>
+        <w:spacing w:line="360" w:lineRule="auto" w:after="120"/>
         <w:jc w:val="left"/>
       </w:pPr>
       <w:r>
         <w:rPr>
           <w:rFonts w:ascii="Times New Roman" w:hAnsi="Times New Roman" w:eastAsia="Times New Roman"/>
           <w:b/>
-          <w:i/>
+          <w:i w:val="0"/>
           <w:sz w:val="24"/>
         </w:rPr>
         <w:t>Переопределение TRAV13-1: признак аллоответа, а не базовой линии g1</w:t>
@@ -1252,7 +1244,7 @@
     </w:p>
     <w:p>
       <w:pPr>
-        <w:spacing w:after="120"/>
+        <w:spacing w:line="360" w:lineRule="auto" w:after="120"/>
         <w:ind w:firstLine="709"/>
         <w:jc w:val="both"/>
       </w:pPr>
@@ -1268,14 +1260,14 @@
     </w:p>
     <w:p>
       <w:pPr>
-        <w:spacing w:after="80"/>
+        <w:spacing w:line="360" w:lineRule="auto" w:after="120"/>
         <w:jc w:val="left"/>
       </w:pPr>
       <w:r>
         <w:rPr>
           <w:rFonts w:ascii="Times New Roman" w:hAnsi="Times New Roman" w:eastAsia="Times New Roman"/>
           <w:b/>
-          <w:i/>
+          <w:i w:val="0"/>
           <w:sz w:val="24"/>
         </w:rPr>
         <w:t>Уровень мотивов: конвергентные CDR3, недоступные агрегированию по V-сегментам</w:t>
@@ -1283,7 +1275,7 @@
     </w:p>
     <w:p>
       <w:pPr>
-        <w:spacing w:after="120"/>
+        <w:spacing w:line="360" w:lineRule="auto" w:after="120"/>
         <w:ind w:firstLine="709"/>
         <w:jc w:val="both"/>
       </w:pPr>
@@ -1299,7 +1291,7 @@
     </w:p>
     <w:p>
       <w:pPr>
-        <w:spacing w:after="120"/>
+        <w:spacing w:line="360" w:lineRule="auto" w:after="120"/>
         <w:ind w:firstLine="709"/>
         <w:jc w:val="both"/>
       </w:pPr>
@@ -1315,7 +1307,7 @@
     </w:p>
     <w:p>
       <w:pPr>
-        <w:spacing w:after="120"/>
+        <w:spacing w:line="360" w:lineRule="auto" w:after="120"/>
         <w:ind w:firstLine="709"/>
         <w:jc w:val="both"/>
       </w:pPr>
@@ -1331,13 +1323,12 @@
     </w:p>
     <w:p>
       <w:pPr>
-        <w:spacing w:before="120" w:after="40"/>
         <w:jc w:val="center"/>
       </w:pPr>
       <w:r>
         <w:drawing>
           <wp:inline xmlns:a="http://schemas.openxmlformats.org/drawingml/2006/main" xmlns:pic="http://schemas.openxmlformats.org/drawingml/2006/picture">
-            <wp:extent cx="4680000" cy="3340478"/>
+            <wp:extent cx="5400000" cy="3854398"/>
             <wp:docPr id="4" name="Picture 4"/>
             <wp:cNvGraphicFramePr>
               <a:graphicFrameLocks noChangeAspect="1"/>
@@ -1358,7 +1349,7 @@
                   <pic:spPr>
                     <a:xfrm>
                       <a:off x="0" y="0"/>
-                      <a:ext cx="4680000" cy="3340478"/>
+                      <a:ext cx="5400000" cy="3854398"/>
                     </a:xfrm>
                     <a:prstGeom prst="rect"/>
                   </pic:spPr>
@@ -1371,14 +1362,14 @@
     </w:p>
     <w:p>
       <w:pPr>
-        <w:spacing w:after="160"/>
-        <w:jc w:val="center"/>
+        <w:spacing w:line="360" w:lineRule="auto" w:after="160"/>
+        <w:jc w:val="both"/>
       </w:pPr>
       <w:r>
         <w:rPr>
           <w:rFonts w:ascii="Times New Roman" w:hAnsi="Times New Roman" w:eastAsia="Times New Roman"/>
           <w:b w:val="0"/>
-          <w:i w:val="0"/>
+          <w:i/>
           <w:sz w:val="20"/>
         </w:rPr>
         <w:t>Рисунок 4. Логотипы конвергентных мотивов CDR3 для TRAV6-6 (верхняя панель, консенсус CALGDMATGGNNKLTF, позиционная энтропия 0,63 бит) и TRAV4-2 (нижняя панель, консенсус CAAEAGGNEKITF). Высота остатка пропорциональна его информационному вкладу (бит). Тесная конвергентность TRAV6-6 не выявляется при агрегировании по V-сегментам.</w:t>
@@ -1386,14 +1377,14 @@
     </w:p>
     <w:p>
       <w:pPr>
-        <w:spacing w:after="80"/>
+        <w:spacing w:line="360" w:lineRule="auto" w:after="120"/>
         <w:jc w:val="left"/>
       </w:pPr>
       <w:r>
         <w:rPr>
           <w:rFonts w:ascii="Times New Roman" w:hAnsi="Times New Roman" w:eastAsia="Times New Roman"/>
           <w:b/>
-          <w:i/>
+          <w:i w:val="0"/>
           <w:sz w:val="24"/>
         </w:rPr>
         <w:t>Расширенные контрасты: аллогенный костный мозг перестраивает репертуар, тимус донора не добавляет отдельного следа</w:t>
@@ -1401,7 +1392,7 @@
     </w:p>
     <w:p>
       <w:pPr>
-        <w:spacing w:after="120"/>
+        <w:spacing w:line="360" w:lineRule="auto" w:after="120"/>
         <w:ind w:firstLine="709"/>
         <w:jc w:val="both"/>
       </w:pPr>
@@ -1417,7 +1408,7 @@
     </w:p>
     <w:p>
       <w:pPr>
-        <w:spacing w:after="120"/>
+        <w:spacing w:line="360" w:lineRule="auto" w:after="120"/>
         <w:ind w:firstLine="709"/>
         <w:jc w:val="both"/>
       </w:pPr>
@@ -1433,13 +1424,12 @@
     </w:p>
     <w:p>
       <w:pPr>
-        <w:spacing w:before="120" w:after="40"/>
         <w:jc w:val="center"/>
       </w:pPr>
       <w:r>
         <w:drawing>
           <wp:inline xmlns:a="http://schemas.openxmlformats.org/drawingml/2006/main" xmlns:pic="http://schemas.openxmlformats.org/drawingml/2006/picture">
-            <wp:extent cx="4680000" cy="2771150"/>
+            <wp:extent cx="5400000" cy="3197480"/>
             <wp:docPr id="5" name="Picture 5"/>
             <wp:cNvGraphicFramePr>
               <a:graphicFrameLocks noChangeAspect="1"/>
@@ -1460,7 +1450,7 @@
                   <pic:spPr>
                     <a:xfrm>
                       <a:off x="0" y="0"/>
-                      <a:ext cx="4680000" cy="2771150"/>
+                      <a:ext cx="5400000" cy="3197480"/>
                     </a:xfrm>
                     <a:prstGeom prst="rect"/>
                   </pic:spPr>
@@ -1473,14 +1463,14 @@
     </w:p>
     <w:p>
       <w:pPr>
-        <w:spacing w:after="160"/>
-        <w:jc w:val="center"/>
+        <w:spacing w:line="360" w:lineRule="auto" w:after="160"/>
+        <w:jc w:val="both"/>
       </w:pPr>
       <w:r>
         <w:rPr>
           <w:rFonts w:ascii="Times New Roman" w:hAnsi="Times New Roman" w:eastAsia="Times New Roman"/>
           <w:b w:val="0"/>
-          <w:i w:val="0"/>
+          <w:i/>
           <w:sz w:val="20"/>
         </w:rPr>
         <w:t>Рисунок 5. Число обогащённых клонотипов в расширенных контрастах. Аллогенный костный мозг относительно сингенного (g5 против g3) перестраивает репертуар (82 590 клонотипов); добавление тимуса донора (g6 против g5) и сравнение тимических источников внутри g6 практически не дают отдельного сигнала.</w:t>
@@ -1488,14 +1478,14 @@
     </w:p>
     <w:p>
       <w:pPr>
-        <w:spacing w:after="80"/>
+        <w:spacing w:line="360" w:lineRule="auto" w:after="120"/>
         <w:jc w:val="left"/>
       </w:pPr>
       <w:r>
         <w:rPr>
           <w:rFonts w:ascii="Times New Roman" w:hAnsi="Times New Roman" w:eastAsia="Times New Roman"/>
           <w:b/>
-          <w:i/>
+          <w:i w:val="0"/>
           <w:sz w:val="24"/>
         </w:rPr>
         <w:t>Устойчивость выводов к включению J-сегмента</w:t>
@@ -1503,7 +1493,7 @@
     </w:p>
     <w:p>
       <w:pPr>
-        <w:spacing w:after="120"/>
+        <w:spacing w:line="360" w:lineRule="auto" w:after="120"/>
         <w:ind w:firstLine="709"/>
         <w:jc w:val="both"/>
       </w:pPr>
@@ -1514,12 +1504,12 @@
           <w:i w:val="0"/>
           <w:sz w:val="24"/>
         </w:rPr>
-        <w:t>При заданном определении клонотипа добавление J-сегмента оказалось практически избыточным: из 1 084 606 уникальных пар (CDR3, V) лишь 1 232 (0,11%) соответствовали более чем одному J-сегменту, а максимум составлял три J на пару. Как следствие, ранжирование V-сегментов, полученное на клонотипах aaVJ, почти совпало с ранжированием плотностного анализа на aaV (коэффициент Спирмена 0,93; p = 1,8 × 10⁻³⁶); все пять кандидатов исходной работы сохранили положение в верхней трети из 82 V-сегментов (рис. 6). Отдельно отметим, что на клонотипах aaVJ первое место занял TRAV6-6, что независимо подкрепляет вывод о его конвергентности.</w:t>
+        <w:t>При заданном определении клонотипа добавление J-сегмента оказалось практически избыточным: из 1 084 606 уникальных пар (CDR3, V) лишь 1 232 (0,11%) соответствовали более чем одному J-сегменту, а максимум составлял три J на пару. Как следствие, ранжирование V-сегментов, полученное на клонотипах aaVJ, почти совпало с ранжированием плотностного анализа на aaV (коэффициент Спирмена 0,93; p = 1,8 × 10⁻³⁶); четыре из пяти кандидатов исходной работы сохранили положение в верхней трети из 82 V-сегментов (ранги 6–25), а пятый, TRAV13-1, расположился на 29-м месте — вблизи её границы, что согласуется с его пограничным статусом по плотностной линии (рис. 6). Отдельно отметим, что на клонотипах aaVJ первое место занял TRAV6-6, что независимо подкрепляет вывод о его конвергентности.</w:t>
       </w:r>
     </w:p>
     <w:p>
       <w:pPr>
-        <w:spacing w:after="120"/>
+        <w:spacing w:line="360" w:lineRule="auto" w:after="120"/>
         <w:ind w:firstLine="709"/>
         <w:jc w:val="both"/>
       </w:pPr>
@@ -1535,13 +1525,12 @@
     </w:p>
     <w:p>
       <w:pPr>
-        <w:spacing w:before="120" w:after="40"/>
         <w:jc w:val="center"/>
       </w:pPr>
       <w:r>
         <w:drawing>
           <wp:inline xmlns:a="http://schemas.openxmlformats.org/drawingml/2006/main" xmlns:pic="http://schemas.openxmlformats.org/drawingml/2006/picture">
-            <wp:extent cx="4680000" cy="4956667"/>
+            <wp:extent cx="5400000" cy="5719231"/>
             <wp:docPr id="6" name="Picture 6"/>
             <wp:cNvGraphicFramePr>
               <a:graphicFrameLocks noChangeAspect="1"/>
@@ -1562,7 +1551,7 @@
                   <pic:spPr>
                     <a:xfrm>
                       <a:off x="0" y="0"/>
-                      <a:ext cx="4680000" cy="4956667"/>
+                      <a:ext cx="5400000" cy="5719231"/>
                     </a:xfrm>
                     <a:prstGeom prst="rect"/>
                   </pic:spPr>
@@ -1575,14 +1564,14 @@
     </w:p>
     <w:p>
       <w:pPr>
-        <w:spacing w:after="160"/>
-        <w:jc w:val="center"/>
+        <w:spacing w:line="360" w:lineRule="auto" w:after="160"/>
+        <w:jc w:val="both"/>
       </w:pPr>
       <w:r>
         <w:rPr>
           <w:rFonts w:ascii="Times New Roman" w:hAnsi="Times New Roman" w:eastAsia="Times New Roman"/>
           <w:b w:val="0"/>
-          <w:i w:val="0"/>
+          <w:i/>
           <w:sz w:val="20"/>
         </w:rPr>
         <w:t>Рисунок 6. Сопоставление рангов V-сегментов, полученных на клонотипах aaV (плотность, без J) и aaVJ (с J). Точки сосредоточены вдоль диагонали (коэффициент Спирмена 0,93); приоритетные кандидаты (красным) сохраняют верхние ранги. J-сегмент расщепляет лишь 0,11% клонотипов.</w:t>
@@ -1590,7 +1579,7 @@
     </w:p>
     <w:p>
       <w:pPr>
-        <w:spacing w:after="120"/>
+        <w:spacing w:line="360" w:lineRule="auto" w:after="120"/>
         <w:jc w:val="left"/>
       </w:pPr>
       <w:r>
@@ -1605,14 +1594,14 @@
     </w:p>
     <w:p>
       <w:pPr>
-        <w:spacing w:after="80"/>
+        <w:spacing w:line="360" w:lineRule="auto" w:after="120"/>
         <w:jc w:val="left"/>
       </w:pPr>
       <w:r>
         <w:rPr>
           <w:rFonts w:ascii="Times New Roman" w:hAnsi="Times New Roman" w:eastAsia="Times New Roman"/>
           <w:b/>
-          <w:i/>
+          <w:i w:val="0"/>
           <w:sz w:val="24"/>
         </w:rPr>
         <w:t>Согласованность трёх независимых линий как аргумент достоверности</w:t>
@@ -1620,7 +1609,7 @@
     </w:p>
     <w:p>
       <w:pPr>
-        <w:spacing w:after="120"/>
+        <w:spacing w:line="360" w:lineRule="auto" w:after="120"/>
         <w:ind w:firstLine="709"/>
         <w:jc w:val="both"/>
       </w:pPr>
@@ -1636,14 +1625,14 @@
     </w:p>
     <w:p>
       <w:pPr>
-        <w:spacing w:after="80"/>
+        <w:spacing w:line="360" w:lineRule="auto" w:after="120"/>
         <w:jc w:val="left"/>
       </w:pPr>
       <w:r>
         <w:rPr>
           <w:rFonts w:ascii="Times New Roman" w:hAnsi="Times New Roman" w:eastAsia="Times New Roman"/>
           <w:b/>
-          <w:i/>
+          <w:i w:val="0"/>
           <w:sz w:val="24"/>
         </w:rPr>
         <w:t>Что даёт вложение сверх методов точных меток</w:t>
@@ -1651,7 +1640,7 @@
     </w:p>
     <w:p>
       <w:pPr>
-        <w:spacing w:after="120"/>
+        <w:spacing w:line="360" w:lineRule="auto" w:after="120"/>
         <w:ind w:firstLine="709"/>
         <w:jc w:val="both"/>
       </w:pPr>
@@ -1667,7 +1656,7 @@
     </w:p>
     <w:p>
       <w:pPr>
-        <w:spacing w:after="120"/>
+        <w:spacing w:line="360" w:lineRule="auto" w:after="120"/>
         <w:ind w:firstLine="709"/>
         <w:jc w:val="both"/>
       </w:pPr>
@@ -1683,14 +1672,14 @@
     </w:p>
     <w:p>
       <w:pPr>
-        <w:spacing w:after="80"/>
+        <w:spacing w:line="360" w:lineRule="auto" w:after="120"/>
         <w:jc w:val="left"/>
       </w:pPr>
       <w:r>
         <w:rPr>
           <w:rFonts w:ascii="Times New Roman" w:hAnsi="Times New Roman" w:eastAsia="Times New Roman"/>
           <w:b/>
-          <w:i/>
+          <w:i w:val="0"/>
           <w:sz w:val="24"/>
         </w:rPr>
         <w:t>Содержательное переосмысление отдельных сигналов</w:t>
@@ -1698,7 +1687,7 @@
     </w:p>
     <w:p>
       <w:pPr>
-        <w:spacing w:after="120"/>
+        <w:spacing w:line="360" w:lineRule="auto" w:after="120"/>
         <w:ind w:firstLine="709"/>
         <w:jc w:val="both"/>
       </w:pPr>
@@ -1714,7 +1703,7 @@
     </w:p>
     <w:p>
       <w:pPr>
-        <w:spacing w:after="120"/>
+        <w:spacing w:line="360" w:lineRule="auto" w:after="120"/>
         <w:ind w:firstLine="709"/>
         <w:jc w:val="both"/>
       </w:pPr>
@@ -1730,14 +1719,14 @@
     </w:p>
     <w:p>
       <w:pPr>
-        <w:spacing w:after="80"/>
+        <w:spacing w:line="360" w:lineRule="auto" w:after="120"/>
         <w:jc w:val="left"/>
       </w:pPr>
       <w:r>
         <w:rPr>
           <w:rFonts w:ascii="Times New Roman" w:hAnsi="Times New Roman" w:eastAsia="Times New Roman"/>
           <w:b/>
-          <w:i/>
+          <w:i w:val="0"/>
           <w:sz w:val="24"/>
         </w:rPr>
         <w:t>Причины расхождений между подходами</w:t>
@@ -1745,7 +1734,7 @@
     </w:p>
     <w:p>
       <w:pPr>
-        <w:spacing w:after="120"/>
+        <w:spacing w:line="360" w:lineRule="auto" w:after="120"/>
         <w:ind w:firstLine="709"/>
         <w:jc w:val="both"/>
       </w:pPr>
@@ -1761,14 +1750,14 @@
     </w:p>
     <w:p>
       <w:pPr>
-        <w:spacing w:after="80"/>
+        <w:spacing w:line="360" w:lineRule="auto" w:after="120"/>
         <w:jc w:val="left"/>
       </w:pPr>
       <w:r>
         <w:rPr>
           <w:rFonts w:ascii="Times New Roman" w:hAnsi="Times New Roman" w:eastAsia="Times New Roman"/>
           <w:b/>
-          <w:i/>
+          <w:i w:val="0"/>
           <w:sz w:val="24"/>
         </w:rPr>
         <w:t>Ограничения</w:t>
@@ -1776,7 +1765,7 @@
     </w:p>
     <w:p>
       <w:pPr>
-        <w:spacing w:after="120"/>
+        <w:spacing w:line="360" w:lineRule="auto" w:after="120"/>
         <w:ind w:firstLine="709"/>
         <w:jc w:val="both"/>
       </w:pPr>
@@ -1792,14 +1781,14 @@
     </w:p>
     <w:p>
       <w:pPr>
-        <w:spacing w:after="80"/>
+        <w:spacing w:line="360" w:lineRule="auto" w:after="120"/>
         <w:jc w:val="left"/>
       </w:pPr>
       <w:r>
         <w:rPr>
           <w:rFonts w:ascii="Times New Roman" w:hAnsi="Times New Roman" w:eastAsia="Times New Roman"/>
           <w:b/>
-          <w:i/>
+          <w:i w:val="0"/>
           <w:sz w:val="24"/>
         </w:rPr>
         <w:t>Платформенное значение</w:t>
@@ -1807,7 +1796,7 @@
     </w:p>
     <w:p>
       <w:pPr>
-        <w:spacing w:after="120"/>
+        <w:spacing w:line="360" w:lineRule="auto" w:after="120"/>
         <w:ind w:firstLine="709"/>
         <w:jc w:val="both"/>
       </w:pPr>
@@ -1823,7 +1812,7 @@
     </w:p>
     <w:p>
       <w:pPr>
-        <w:spacing w:after="120"/>
+        <w:spacing w:line="360" w:lineRule="auto" w:after="120"/>
         <w:jc w:val="left"/>
       </w:pPr>
       <w:r>
@@ -1838,7 +1827,7 @@
     </w:p>
     <w:p>
       <w:pPr>
-        <w:spacing w:after="120"/>
+        <w:spacing w:line="360" w:lineRule="auto" w:after="120"/>
         <w:ind w:firstLine="709"/>
         <w:jc w:val="both"/>
       </w:pPr>
@@ -1854,7 +1843,7 @@
     </w:p>
     <w:p>
       <w:pPr>
-        <w:spacing w:after="120"/>
+        <w:spacing w:line="360" w:lineRule="auto" w:after="120"/>
         <w:ind w:firstLine="709"/>
         <w:jc w:val="both"/>
       </w:pPr>
@@ -1870,7 +1859,7 @@
     </w:p>
     <w:p>
       <w:pPr>
-        <w:spacing w:after="120"/>
+        <w:spacing w:line="360" w:lineRule="auto" w:after="120"/>
         <w:ind w:firstLine="709"/>
         <w:jc w:val="both"/>
       </w:pPr>
@@ -1886,7 +1875,7 @@
     </w:p>
     <w:p>
       <w:pPr>
-        <w:spacing w:after="120"/>
+        <w:spacing w:line="360" w:lineRule="auto" w:after="120"/>
         <w:ind w:firstLine="709"/>
         <w:jc w:val="both"/>
       </w:pPr>
@@ -1902,7 +1891,7 @@
     </w:p>
     <w:p>
       <w:pPr>
-        <w:spacing w:after="120"/>
+        <w:spacing w:line="360" w:lineRule="auto" w:after="120"/>
         <w:ind w:firstLine="709"/>
         <w:jc w:val="both"/>
       </w:pPr>
@@ -1918,7 +1907,7 @@
     </w:p>
     <w:p>
       <w:pPr>
-        <w:spacing w:after="120"/>
+        <w:spacing w:line="360" w:lineRule="auto" w:after="120"/>
         <w:jc w:val="left"/>
       </w:pPr>
       <w:r>
@@ -1933,7 +1922,7 @@
     </w:p>
     <w:p>
       <w:pPr>
-        <w:spacing w:after="120"/>
+        <w:spacing w:line="360" w:lineRule="auto" w:after="120"/>
         <w:ind w:firstLine="709"/>
         <w:jc w:val="both"/>
       </w:pPr>
@@ -1949,7 +1938,7 @@
     </w:p>
     <w:p>
       <w:pPr>
-        <w:spacing w:after="120"/>
+        <w:spacing w:line="360" w:lineRule="auto" w:after="120"/>
         <w:ind w:firstLine="709"/>
         <w:jc w:val="both"/>
       </w:pPr>
@@ -1965,7 +1954,7 @@
     </w:p>
     <w:p>
       <w:pPr>
-        <w:spacing w:after="120"/>
+        <w:spacing w:line="360" w:lineRule="auto" w:after="120"/>
         <w:jc w:val="left"/>
       </w:pPr>
       <w:r>
@@ -1980,7 +1969,7 @@
     </w:p>
     <w:p>
       <w:pPr>
-        <w:spacing w:after="120"/>
+        <w:spacing w:line="360" w:lineRule="auto" w:after="120"/>
         <w:ind w:firstLine="709"/>
         <w:jc w:val="both"/>
       </w:pPr>
@@ -1996,7 +1985,7 @@
     </w:p>
     <w:p>
       <w:pPr>
-        <w:spacing w:after="120"/>
+        <w:spacing w:line="360" w:lineRule="auto" w:after="120"/>
         <w:jc w:val="left"/>
       </w:pPr>
       <w:r>
@@ -2011,7 +2000,7 @@
     </w:p>
     <w:p>
       <w:pPr>
-        <w:spacing w:after="60"/>
+        <w:spacing w:line="360" w:lineRule="auto" w:after="60"/>
         <w:jc w:val="left"/>
       </w:pPr>
       <w:r>
@@ -2026,7 +2015,7 @@
     </w:p>
     <w:p>
       <w:pPr>
-        <w:spacing w:after="60"/>
+        <w:spacing w:line="360" w:lineRule="auto" w:after="60"/>
         <w:jc w:val="left"/>
       </w:pPr>
       <w:r>
@@ -2041,7 +2030,7 @@
     </w:p>
     <w:p>
       <w:pPr>
-        <w:spacing w:after="60"/>
+        <w:spacing w:line="360" w:lineRule="auto" w:after="60"/>
         <w:jc w:val="left"/>
       </w:pPr>
       <w:r>
@@ -2056,7 +2045,7 @@
     </w:p>
     <w:p>
       <w:pPr>
-        <w:spacing w:after="60"/>
+        <w:spacing w:line="360" w:lineRule="auto" w:after="60"/>
         <w:jc w:val="left"/>
       </w:pPr>
       <w:r>
@@ -2071,7 +2060,7 @@
     </w:p>
     <w:p>
       <w:pPr>
-        <w:spacing w:after="60"/>
+        <w:spacing w:line="360" w:lineRule="auto" w:after="60"/>
         <w:jc w:val="left"/>
       </w:pPr>
       <w:r>
@@ -2086,7 +2075,7 @@
     </w:p>
     <w:p>
       <w:pPr>
-        <w:spacing w:after="60"/>
+        <w:spacing w:line="360" w:lineRule="auto" w:after="60"/>
         <w:jc w:val="left"/>
       </w:pPr>
       <w:r>
@@ -2101,7 +2090,7 @@
     </w:p>
     <w:p>
       <w:pPr>
-        <w:spacing w:after="60"/>
+        <w:spacing w:line="360" w:lineRule="auto" w:after="60"/>
         <w:jc w:val="left"/>
       </w:pPr>
       <w:r>
@@ -2116,7 +2105,7 @@
     </w:p>
     <w:p>
       <w:pPr>
-        <w:spacing w:after="60"/>
+        <w:spacing w:line="360" w:lineRule="auto" w:after="60"/>
         <w:jc w:val="left"/>
       </w:pPr>
       <w:r>
@@ -2131,7 +2120,7 @@
     </w:p>
     <w:p>
       <w:pPr>
-        <w:spacing w:after="60"/>
+        <w:spacing w:line="360" w:lineRule="auto" w:after="60"/>
         <w:jc w:val="left"/>
       </w:pPr>
       <w:r>
@@ -2146,7 +2135,7 @@
     </w:p>
     <w:p>
       <w:pPr>
-        <w:spacing w:after="60"/>
+        <w:spacing w:line="360" w:lineRule="auto" w:after="60"/>
         <w:jc w:val="left"/>
       </w:pPr>
       <w:r>
@@ -2161,7 +2150,7 @@
     </w:p>
     <w:p>
       <w:pPr>
-        <w:spacing w:after="60"/>
+        <w:spacing w:line="360" w:lineRule="auto" w:after="60"/>
         <w:jc w:val="left"/>
       </w:pPr>
       <w:r>
@@ -2176,7 +2165,7 @@
     </w:p>
     <w:p>
       <w:pPr>
-        <w:spacing w:after="60"/>
+        <w:spacing w:line="360" w:lineRule="auto" w:after="60"/>
         <w:jc w:val="left"/>
       </w:pPr>
       <w:r>
@@ -2191,7 +2180,7 @@
     </w:p>
     <w:p>
       <w:pPr>
-        <w:spacing w:after="60"/>
+        <w:spacing w:line="360" w:lineRule="auto" w:after="60"/>
         <w:jc w:val="left"/>
       </w:pPr>
       <w:r>
@@ -2206,7 +2195,7 @@
     </w:p>
     <w:p>
       <w:pPr>
-        <w:spacing w:after="60"/>
+        <w:spacing w:line="360" w:lineRule="auto" w:after="60"/>
         <w:jc w:val="left"/>
       </w:pPr>
       <w:r>
@@ -2221,7 +2210,7 @@
     </w:p>
     <w:p>
       <w:pPr>
-        <w:spacing w:after="60"/>
+        <w:spacing w:line="360" w:lineRule="auto" w:after="60"/>
         <w:jc w:val="left"/>
       </w:pPr>
       <w:r>
@@ -2236,7 +2225,7 @@
     </w:p>
     <w:p>
       <w:pPr>
-        <w:spacing w:after="60"/>
+        <w:spacing w:line="360" w:lineRule="auto" w:after="60"/>
         <w:jc w:val="left"/>
       </w:pPr>
       <w:r>
@@ -2251,7 +2240,7 @@
     </w:p>
     <w:p>
       <w:pPr>
-        <w:spacing w:after="60"/>
+        <w:spacing w:line="360" w:lineRule="auto" w:after="60"/>
         <w:jc w:val="left"/>
       </w:pPr>
       <w:r>
@@ -2266,7 +2255,7 @@
     </w:p>
     <w:p>
       <w:pPr>
-        <w:spacing w:after="60"/>
+        <w:spacing w:line="360" w:lineRule="auto" w:after="60"/>
         <w:jc w:val="left"/>
       </w:pPr>
       <w:r>
@@ -2281,7 +2270,7 @@
     </w:p>
     <w:p>
       <w:pPr>
-        <w:spacing w:after="60"/>
+        <w:spacing w:line="360" w:lineRule="auto" w:after="60"/>
         <w:jc w:val="left"/>
       </w:pPr>
       <w:r>
@@ -2296,7 +2285,7 @@
     </w:p>
     <w:p>
       <w:pPr>
-        <w:spacing w:after="60"/>
+        <w:spacing w:line="360" w:lineRule="auto" w:after="60"/>
         <w:jc w:val="left"/>
       </w:pPr>
       <w:r>
@@ -2311,7 +2300,7 @@
     </w:p>
     <w:p>
       <w:pPr>
-        <w:spacing w:after="60"/>
+        <w:spacing w:line="360" w:lineRule="auto" w:after="60"/>
         <w:jc w:val="left"/>
       </w:pPr>
       <w:r>
@@ -2326,7 +2315,7 @@
     </w:p>
     <w:p>
       <w:pPr>
-        <w:spacing w:after="60"/>
+        <w:spacing w:line="360" w:lineRule="auto" w:after="60"/>
         <w:jc w:val="left"/>
       </w:pPr>
       <w:r>
@@ -2341,7 +2330,7 @@
     </w:p>
     <w:p>
       <w:pPr>
-        <w:spacing w:after="60"/>
+        <w:spacing w:line="360" w:lineRule="auto" w:after="60"/>
         <w:jc w:val="left"/>
       </w:pPr>
       <w:r>
@@ -2356,7 +2345,7 @@
     </w:p>
     <w:p>
       <w:pPr>
-        <w:spacing w:after="60"/>
+        <w:spacing w:line="360" w:lineRule="auto" w:after="60"/>
         <w:jc w:val="left"/>
       </w:pPr>
       <w:r>
@@ -2371,7 +2360,7 @@
     </w:p>
     <w:p>
       <w:pPr>
-        <w:spacing w:after="60"/>
+        <w:spacing w:line="360" w:lineRule="auto" w:after="60"/>
         <w:jc w:val="left"/>
       </w:pPr>
       <w:r>
@@ -2386,7 +2375,7 @@
     </w:p>
     <w:p>
       <w:pPr>
-        <w:spacing w:after="60"/>
+        <w:spacing w:line="360" w:lineRule="auto" w:after="60"/>
         <w:jc w:val="left"/>
       </w:pPr>
       <w:r>
@@ -2401,7 +2390,7 @@
     </w:p>
     <w:p>
       <w:pPr>
-        <w:spacing w:after="60"/>
+        <w:spacing w:line="360" w:lineRule="auto" w:after="60"/>
         <w:jc w:val="left"/>
       </w:pPr>
       <w:r>
@@ -2416,7 +2405,7 @@
     </w:p>
     <w:p>
       <w:pPr>
-        <w:spacing w:after="60"/>
+        <w:spacing w:line="360" w:lineRule="auto" w:after="60"/>
         <w:jc w:val="left"/>
       </w:pPr>
       <w:r>
@@ -2431,7 +2420,7 @@
     </w:p>
     <w:p>
       <w:pPr>
-        <w:spacing w:after="60"/>
+        <w:spacing w:line="360" w:lineRule="auto" w:after="60"/>
         <w:jc w:val="left"/>
       </w:pPr>
       <w:r>
@@ -2446,7 +2435,7 @@
     </w:p>
     <w:p>
       <w:pPr>
-        <w:spacing w:after="60"/>
+        <w:spacing w:line="360" w:lineRule="auto" w:after="60"/>
         <w:jc w:val="left"/>
       </w:pPr>
       <w:r>
@@ -2461,7 +2450,7 @@
     </w:p>
     <w:p>
       <w:pPr>
-        <w:spacing w:after="60"/>
+        <w:spacing w:line="360" w:lineRule="auto" w:after="60"/>
         <w:jc w:val="left"/>
       </w:pPr>
       <w:r>
@@ -2476,7 +2465,7 @@
     </w:p>
     <w:p>
       <w:pPr>
-        <w:spacing w:after="60"/>
+        <w:spacing w:line="360" w:lineRule="auto" w:after="60"/>
         <w:jc w:val="left"/>
       </w:pPr>
       <w:r>
@@ -2491,7 +2480,7 @@
     </w:p>
     <w:p>
       <w:pPr>
-        <w:spacing w:after="60"/>
+        <w:spacing w:line="360" w:lineRule="auto" w:after="60"/>
         <w:jc w:val="left"/>
       </w:pPr>
       <w:r>
@@ -2506,7 +2495,7 @@
     </w:p>
     <w:p>
       <w:pPr>
-        <w:spacing w:after="60"/>
+        <w:spacing w:line="360" w:lineRule="auto" w:after="60"/>
         <w:jc w:val="left"/>
       </w:pPr>
       <w:r>
@@ -2521,7 +2510,7 @@
     </w:p>
     <w:p>
       <w:pPr>
-        <w:spacing w:after="60"/>
+        <w:spacing w:line="360" w:lineRule="auto" w:after="60"/>
         <w:jc w:val="left"/>
       </w:pPr>
       <w:r>
@@ -2536,7 +2525,7 @@
     </w:p>
     <w:p>
       <w:pPr>
-        <w:spacing w:after="60"/>
+        <w:spacing w:line="360" w:lineRule="auto" w:after="60"/>
         <w:jc w:val="left"/>
       </w:pPr>
       <w:r>
@@ -2551,7 +2540,7 @@
     </w:p>
     <w:p>
       <w:pPr>
-        <w:spacing w:after="60"/>
+        <w:spacing w:line="360" w:lineRule="auto" w:after="60"/>
         <w:jc w:val="left"/>
       </w:pPr>
       <w:r>
@@ -2566,7 +2555,7 @@
     </w:p>
     <w:p>
       <w:pPr>
-        <w:spacing w:after="60"/>
+        <w:spacing w:line="360" w:lineRule="auto" w:after="60"/>
         <w:jc w:val="left"/>
       </w:pPr>
       <w:r>
@@ -2581,7 +2570,7 @@
     </w:p>
     <w:p>
       <w:pPr>
-        <w:spacing w:after="60"/>
+        <w:spacing w:line="360" w:lineRule="auto" w:after="60"/>
         <w:jc w:val="left"/>
       </w:pPr>
       <w:r>
@@ -2596,7 +2585,7 @@
     </w:p>
     <w:p>
       <w:pPr>
-        <w:spacing w:after="60"/>
+        <w:spacing w:line="360" w:lineRule="auto" w:after="60"/>
         <w:jc w:val="left"/>
       </w:pPr>
       <w:r>
@@ -2611,7 +2600,7 @@
     </w:p>
     <w:p>
       <w:pPr>
-        <w:spacing w:after="60"/>
+        <w:spacing w:line="360" w:lineRule="auto" w:after="60"/>
         <w:jc w:val="left"/>
       </w:pPr>
       <w:r>
@@ -2626,7 +2615,7 @@
     </w:p>
     <w:p>
       <w:pPr>
-        <w:spacing w:after="60"/>
+        <w:spacing w:line="360" w:lineRule="auto" w:after="60"/>
         <w:jc w:val="left"/>
       </w:pPr>
       <w:r>
@@ -2641,7 +2630,7 @@
     </w:p>
     <w:p>
       <w:pPr>
-        <w:spacing w:after="60"/>
+        <w:spacing w:line="360" w:lineRule="auto" w:after="60"/>
         <w:jc w:val="left"/>
       </w:pPr>
       <w:r>
@@ -2656,7 +2645,7 @@
     </w:p>
     <w:p>
       <w:pPr>
-        <w:spacing w:after="60"/>
+        <w:spacing w:line="360" w:lineRule="auto" w:after="60"/>
         <w:jc w:val="left"/>
       </w:pPr>
       <w:r>
@@ -3042,9 +3031,6 @@
     <w:name w:val="Normal"/>
     <w:qFormat/>
     <w:rsid w:val="00FC693F"/>
-    <w:pPr>
-      <w:spacing w:line="360" w:lineRule="auto" w:after="0"/>
-    </w:pPr>
     <w:rPr>
       <w:rFonts w:ascii="Times New Roman" w:hAnsi="Times New Roman" w:eastAsia="Times New Roman"/>
       <w:sz w:val="24"/>

</xml_diff>